<commit_message>
Add table with lower and upper plausible range limits
</commit_message>
<xml_diff>
--- a/Imputed values table.docx
+++ b/Imputed values table.docx
@@ -15,8 +15,6 @@
       <w:r>
         <w:t>Imputed values for missing data.</w:t>
       </w:r>
-      <w:bookmarkStart w:id="0" w:name="_GoBack"/>
-      <w:bookmarkEnd w:id="0"/>
     </w:p>
     <w:tbl>
       <w:tblPr>
@@ -338,6 +336,7 @@
                 <w:szCs w:val="20"/>
               </w:rPr>
             </w:pPr>
+            <w:commentRangeStart w:id="0"/>
             <w:r>
               <w:rPr>
                 <w:rFonts w:ascii="Arial" w:eastAsia="Times New Roman" w:hAnsi="Arial" w:cs="Arial"/>
@@ -348,6 +347,13 @@
                 <w:szCs w:val="20"/>
               </w:rPr>
               <w:t>Arterial lactate</w:t>
+            </w:r>
+            <w:commentRangeEnd w:id="0"/>
+            <w:r>
+              <w:rPr>
+                <w:rStyle w:val="CommentReference"/>
+              </w:rPr>
+              <w:commentReference w:id="0"/>
             </w:r>
           </w:p>
         </w:tc>
@@ -1590,15 +1596,7 @@
                 <w:sz w:val="20"/>
                 <w:szCs w:val="20"/>
               </w:rPr>
-              <w:t xml:space="preserve">LVAD – </w:t>
-            </w:r>
-            <w:r>
-              <w:rPr>
-                <w:rFonts w:ascii="Arial" w:eastAsia="Times New Roman" w:hAnsi="Arial" w:cs="Arial"/>
-                <w:sz w:val="20"/>
-                <w:szCs w:val="20"/>
-              </w:rPr>
-              <w:t>100</w:t>
+              <w:t>LVAD – 100</w:t>
             </w:r>
           </w:p>
           <w:p>
@@ -1617,15 +1615,7 @@
                 <w:sz w:val="20"/>
                 <w:szCs w:val="20"/>
               </w:rPr>
-              <w:t xml:space="preserve">No LVAD – </w:t>
-            </w:r>
-            <w:r>
-              <w:rPr>
-                <w:rFonts w:ascii="Arial" w:eastAsia="Times New Roman" w:hAnsi="Arial" w:cs="Arial"/>
-                <w:sz w:val="20"/>
-                <w:szCs w:val="20"/>
-              </w:rPr>
-              <w:t>110</w:t>
+              <w:t>No LVAD – 110</w:t>
             </w:r>
           </w:p>
         </w:tc>
@@ -1712,23 +1702,7 @@
                 <w:sz w:val="20"/>
                 <w:szCs w:val="20"/>
               </w:rPr>
-              <w:t xml:space="preserve">LVAD – </w:t>
-            </w:r>
-            <w:r>
-              <w:rPr>
-                <w:rFonts w:ascii="Arial" w:eastAsia="Times New Roman" w:hAnsi="Arial" w:cs="Arial"/>
-                <w:sz w:val="20"/>
-                <w:szCs w:val="20"/>
-              </w:rPr>
-              <w:t>1</w:t>
-            </w:r>
-            <w:r>
-              <w:rPr>
-                <w:rFonts w:ascii="Arial" w:eastAsia="Times New Roman" w:hAnsi="Arial" w:cs="Arial"/>
-                <w:sz w:val="20"/>
-                <w:szCs w:val="20"/>
-              </w:rPr>
-              <w:t>5</w:t>
+              <w:t>LVAD – 15</w:t>
             </w:r>
           </w:p>
           <w:p>
@@ -1747,23 +1721,7 @@
                 <w:sz w:val="20"/>
                 <w:szCs w:val="20"/>
               </w:rPr>
-              <w:t xml:space="preserve">No LVAD – </w:t>
-            </w:r>
-            <w:r>
-              <w:rPr>
-                <w:rFonts w:ascii="Arial" w:eastAsia="Times New Roman" w:hAnsi="Arial" w:cs="Arial"/>
-                <w:sz w:val="20"/>
-                <w:szCs w:val="20"/>
-              </w:rPr>
-              <w:t>1</w:t>
-            </w:r>
-            <w:r>
-              <w:rPr>
-                <w:rFonts w:ascii="Arial" w:eastAsia="Times New Roman" w:hAnsi="Arial" w:cs="Arial"/>
-                <w:sz w:val="20"/>
-                <w:szCs w:val="20"/>
-              </w:rPr>
-              <w:t>8</w:t>
+              <w:t>No LVAD – 18</w:t>
             </w:r>
           </w:p>
         </w:tc>
@@ -1850,15 +1808,7 @@
                 <w:sz w:val="20"/>
                 <w:szCs w:val="20"/>
               </w:rPr>
-              <w:t xml:space="preserve">LVAD – </w:t>
-            </w:r>
-            <w:r>
-              <w:rPr>
-                <w:rFonts w:ascii="Arial" w:eastAsia="Times New Roman" w:hAnsi="Arial" w:cs="Arial"/>
-                <w:sz w:val="20"/>
-                <w:szCs w:val="20"/>
-              </w:rPr>
-              <w:t>35</w:t>
+              <w:t>LVAD – 35</w:t>
             </w:r>
           </w:p>
           <w:p>
@@ -1877,15 +1827,7 @@
                 <w:sz w:val="20"/>
                 <w:szCs w:val="20"/>
               </w:rPr>
-              <w:t xml:space="preserve">No LVAD – </w:t>
-            </w:r>
-            <w:r>
-              <w:rPr>
-                <w:rFonts w:ascii="Arial" w:eastAsia="Times New Roman" w:hAnsi="Arial" w:cs="Arial"/>
-                <w:sz w:val="20"/>
-                <w:szCs w:val="20"/>
-              </w:rPr>
-              <w:t>38</w:t>
+              <w:t>No LVAD – 38</w:t>
             </w:r>
           </w:p>
         </w:tc>
@@ -1972,23 +1914,7 @@
                 <w:sz w:val="20"/>
                 <w:szCs w:val="20"/>
               </w:rPr>
-              <w:t xml:space="preserve">LVAD – </w:t>
-            </w:r>
-            <w:r>
-              <w:rPr>
-                <w:rFonts w:ascii="Arial" w:eastAsia="Times New Roman" w:hAnsi="Arial" w:cs="Arial"/>
-                <w:sz w:val="20"/>
-                <w:szCs w:val="20"/>
-              </w:rPr>
-              <w:t>1</w:t>
-            </w:r>
-            <w:r>
-              <w:rPr>
-                <w:rFonts w:ascii="Arial" w:eastAsia="Times New Roman" w:hAnsi="Arial" w:cs="Arial"/>
-                <w:sz w:val="20"/>
-                <w:szCs w:val="20"/>
-              </w:rPr>
-              <w:t>5</w:t>
+              <w:t>LVAD – 15</w:t>
             </w:r>
           </w:p>
           <w:p>
@@ -2007,15 +1933,7 @@
                 <w:sz w:val="20"/>
                 <w:szCs w:val="20"/>
               </w:rPr>
-              <w:t xml:space="preserve">No LVAD – </w:t>
-            </w:r>
-            <w:r>
-              <w:rPr>
-                <w:rFonts w:ascii="Arial" w:eastAsia="Times New Roman" w:hAnsi="Arial" w:cs="Arial"/>
-                <w:sz w:val="20"/>
-                <w:szCs w:val="20"/>
-              </w:rPr>
-              <w:t>18</w:t>
+              <w:t>No LVAD – 18</w:t>
             </w:r>
           </w:p>
         </w:tc>
@@ -2183,16 +2101,16 @@
       </w:tr>
     </w:tbl>
     <w:p>
-      <w:commentRangeStart w:id="1"/>
+      <w:commentRangeStart w:id="2"/>
       <w:r>
         <w:t>*Median from cohort data</w:t>
       </w:r>
-      <w:commentRangeEnd w:id="1"/>
+      <w:commentRangeEnd w:id="2"/>
       <w:r>
         <w:rPr>
           <w:rStyle w:val="CommentReference"/>
         </w:rPr>
-        <w:commentReference w:id="1"/>
+        <w:commentReference w:id="2"/>
       </w:r>
     </w:p>
     <w:p/>
@@ -2208,7 +2126,25 @@
 
 <file path=word/comments.xml><?xml version="1.0" encoding="utf-8"?>
 <w:comments xmlns:wpc="http://schemas.microsoft.com/office/word/2010/wordprocessingCanvas" xmlns:cx="http://schemas.microsoft.com/office/drawing/2014/chartex" xmlns:cx1="http://schemas.microsoft.com/office/drawing/2015/9/8/chartex" xmlns:cx2="http://schemas.microsoft.com/office/drawing/2015/10/21/chartex" xmlns:cx3="http://schemas.microsoft.com/office/drawing/2016/5/9/chartex" xmlns:cx4="http://schemas.microsoft.com/office/drawing/2016/5/10/chartex" xmlns:cx5="http://schemas.microsoft.com/office/drawing/2016/5/11/chartex" xmlns:cx6="http://schemas.microsoft.com/office/drawing/2016/5/12/chartex" xmlns:cx7="http://schemas.microsoft.com/office/drawing/2016/5/13/chartex" xmlns:cx8="http://schemas.microsoft.com/office/drawing/2016/5/14/chartex" xmlns:mc="http://schemas.openxmlformats.org/markup-compatibility/2006" xmlns:aink="http://schemas.microsoft.com/office/drawing/2016/ink" xmlns:am3d="http://schemas.microsoft.com/office/drawing/2017/model3d" xmlns:o="urn:schemas-microsoft-com:office:office" xmlns:r="http://schemas.openxmlformats.org/officeDocument/2006/relationships" xmlns:m="http://schemas.openxmlformats.org/officeDocument/2006/math" xmlns:v="urn:schemas-microsoft-com:vml" xmlns:wp14="http://schemas.microsoft.com/office/word/2010/wordprocessingDrawing" xmlns:wp="http://schemas.openxmlformats.org/drawingml/2006/wordprocessingDrawing" xmlns:w10="urn:schemas-microsoft-com:office:word" xmlns:w="http://schemas.openxmlformats.org/wordprocessingml/2006/main" xmlns:w14="http://schemas.microsoft.com/office/word/2010/wordml" xmlns:w15="http://schemas.microsoft.com/office/word/2012/wordml" xmlns:w16cid="http://schemas.microsoft.com/office/word/2016/wordml/cid" xmlns:w16se="http://schemas.microsoft.com/office/word/2015/wordml/symex" xmlns:wpg="http://schemas.microsoft.com/office/word/2010/wordprocessingGroup" xmlns:wpi="http://schemas.microsoft.com/office/word/2010/wordprocessingInk" xmlns:wne="http://schemas.microsoft.com/office/word/2006/wordml" xmlns:wps="http://schemas.microsoft.com/office/word/2010/wordprocessingShape" mc:Ignorable="w14 w15 w16se w16cid wp14">
-  <w:comment w:id="1" w:author="Grace Lyden" w:date="2025-02-17T14:59:00Z" w:initials="GL">
+  <w:comment w:id="0" w:author="Grace Lyden" w:date="2025-02-17T15:18:00Z" w:initials="GL">
+    <w:p>
+      <w:pPr>
+        <w:pStyle w:val="CommentText"/>
+      </w:pPr>
+      <w:r>
+        <w:rPr>
+          <w:rStyle w:val="CommentReference"/>
+        </w:rPr>
+        <w:annotationRef/>
+      </w:r>
+      <w:r>
+        <w:t>Do we use this at all? Or LDH or hemoglobin?</w:t>
+      </w:r>
+      <w:bookmarkStart w:id="1" w:name="_GoBack"/>
+      <w:bookmarkEnd w:id="1"/>
+    </w:p>
+  </w:comment>
+  <w:comment w:id="2" w:author="Grace Lyden" w:date="2025-02-17T14:59:00Z" w:initials="GL">
     <w:p>
       <w:pPr>
         <w:pStyle w:val="CommentText"/>
@@ -2242,12 +2178,14 @@
 
 <file path=word/commentsExtended.xml><?xml version="1.0" encoding="utf-8"?>
 <w15:commentsEx xmlns:wpc="http://schemas.microsoft.com/office/word/2010/wordprocessingCanvas" xmlns:cx="http://schemas.microsoft.com/office/drawing/2014/chartex" xmlns:cx1="http://schemas.microsoft.com/office/drawing/2015/9/8/chartex" xmlns:cx2="http://schemas.microsoft.com/office/drawing/2015/10/21/chartex" xmlns:cx3="http://schemas.microsoft.com/office/drawing/2016/5/9/chartex" xmlns:cx4="http://schemas.microsoft.com/office/drawing/2016/5/10/chartex" xmlns:cx5="http://schemas.microsoft.com/office/drawing/2016/5/11/chartex" xmlns:cx6="http://schemas.microsoft.com/office/drawing/2016/5/12/chartex" xmlns:cx7="http://schemas.microsoft.com/office/drawing/2016/5/13/chartex" xmlns:cx8="http://schemas.microsoft.com/office/drawing/2016/5/14/chartex" xmlns:mc="http://schemas.openxmlformats.org/markup-compatibility/2006" xmlns:aink="http://schemas.microsoft.com/office/drawing/2016/ink" xmlns:am3d="http://schemas.microsoft.com/office/drawing/2017/model3d" xmlns:o="urn:schemas-microsoft-com:office:office" xmlns:r="http://schemas.openxmlformats.org/officeDocument/2006/relationships" xmlns:m="http://schemas.openxmlformats.org/officeDocument/2006/math" xmlns:v="urn:schemas-microsoft-com:vml" xmlns:wp14="http://schemas.microsoft.com/office/word/2010/wordprocessingDrawing" xmlns:wp="http://schemas.openxmlformats.org/drawingml/2006/wordprocessingDrawing" xmlns:w10="urn:schemas-microsoft-com:office:word" xmlns:w="http://schemas.openxmlformats.org/wordprocessingml/2006/main" xmlns:w14="http://schemas.microsoft.com/office/word/2010/wordml" xmlns:w15="http://schemas.microsoft.com/office/word/2012/wordml" xmlns:w16cid="http://schemas.microsoft.com/office/word/2016/wordml/cid" xmlns:w16se="http://schemas.microsoft.com/office/word/2015/wordml/symex" xmlns:wpg="http://schemas.microsoft.com/office/word/2010/wordprocessingGroup" xmlns:wpi="http://schemas.microsoft.com/office/word/2010/wordprocessingInk" xmlns:wne="http://schemas.microsoft.com/office/word/2006/wordml" xmlns:wps="http://schemas.microsoft.com/office/word/2010/wordprocessingShape" mc:Ignorable="w14 w15 w16se w16cid wp14">
+  <w15:commentEx w15:paraId="442761B6" w15:done="0"/>
   <w15:commentEx w15:paraId="15D735A8" w15:done="0"/>
 </w15:commentsEx>
 </file>
 
 <file path=word/commentsIds.xml><?xml version="1.0" encoding="utf-8"?>
 <w16cid:commentsIds xmlns:wpc="http://schemas.microsoft.com/office/word/2010/wordprocessingCanvas" xmlns:cx="http://schemas.microsoft.com/office/drawing/2014/chartex" xmlns:cx1="http://schemas.microsoft.com/office/drawing/2015/9/8/chartex" xmlns:cx2="http://schemas.microsoft.com/office/drawing/2015/10/21/chartex" xmlns:cx3="http://schemas.microsoft.com/office/drawing/2016/5/9/chartex" xmlns:cx4="http://schemas.microsoft.com/office/drawing/2016/5/10/chartex" xmlns:cx5="http://schemas.microsoft.com/office/drawing/2016/5/11/chartex" xmlns:cx6="http://schemas.microsoft.com/office/drawing/2016/5/12/chartex" xmlns:cx7="http://schemas.microsoft.com/office/drawing/2016/5/13/chartex" xmlns:cx8="http://schemas.microsoft.com/office/drawing/2016/5/14/chartex" xmlns:mc="http://schemas.openxmlformats.org/markup-compatibility/2006" xmlns:aink="http://schemas.microsoft.com/office/drawing/2016/ink" xmlns:am3d="http://schemas.microsoft.com/office/drawing/2017/model3d" xmlns:o="urn:schemas-microsoft-com:office:office" xmlns:r="http://schemas.openxmlformats.org/officeDocument/2006/relationships" xmlns:m="http://schemas.openxmlformats.org/officeDocument/2006/math" xmlns:v="urn:schemas-microsoft-com:vml" xmlns:wp14="http://schemas.microsoft.com/office/word/2010/wordprocessingDrawing" xmlns:wp="http://schemas.openxmlformats.org/drawingml/2006/wordprocessingDrawing" xmlns:w10="urn:schemas-microsoft-com:office:word" xmlns:w="http://schemas.openxmlformats.org/wordprocessingml/2006/main" xmlns:w14="http://schemas.microsoft.com/office/word/2010/wordml" xmlns:w15="http://schemas.microsoft.com/office/word/2012/wordml" xmlns:w16cid="http://schemas.microsoft.com/office/word/2016/wordml/cid" xmlns:w16se="http://schemas.microsoft.com/office/word/2015/wordml/symex" xmlns:wpg="http://schemas.microsoft.com/office/word/2010/wordprocessingGroup" xmlns:wpi="http://schemas.microsoft.com/office/word/2010/wordprocessingInk" xmlns:wne="http://schemas.microsoft.com/office/word/2006/wordml" xmlns:wps="http://schemas.microsoft.com/office/word/2010/wordprocessingShape" mc:Ignorable="w14 w15 w16se w16cid wp14">
+  <w16cid:commentId w16cid:paraId="442761B6" w16cid:durableId="2B5DD1B6"/>
   <w16cid:commentId w16cid:paraId="15D735A8" w16cid:durableId="2B5DCD53"/>
 </w16cid:commentsIds>
 </file>

</xml_diff>

<commit_message>
Table 1 and supplemental tables
</commit_message>
<xml_diff>
--- a/Imputed values table.docx
+++ b/Imputed values table.docx
@@ -4,16 +4,36 @@
   <w:body>
     <w:p>
       <w:r>
+        <w:t xml:space="preserve">Supplemental </w:t>
+      </w:r>
+      <w:bookmarkStart w:id="0" w:name="_GoBack"/>
+      <w:bookmarkEnd w:id="0"/>
+      <w:r>
         <w:t xml:space="preserve">Table </w:t>
       </w:r>
       <w:r>
-        <w:t>x</w:t>
+        <w:t>2</w:t>
       </w:r>
       <w:r>
         <w:t xml:space="preserve">: </w:t>
       </w:r>
       <w:r>
-        <w:t>Imputed values for missing data.</w:t>
+        <w:t>V</w:t>
+      </w:r>
+      <w:r>
+        <w:t xml:space="preserve">alues </w:t>
+      </w:r>
+      <w:r>
+        <w:t xml:space="preserve">used to impute </w:t>
+      </w:r>
+      <w:r>
+        <w:t xml:space="preserve">missing </w:t>
+      </w:r>
+      <w:r>
+        <w:t xml:space="preserve">and out-of-bounds </w:t>
+      </w:r>
+      <w:r>
+        <w:t>data.</w:t>
       </w:r>
     </w:p>
     <w:tbl>
@@ -27,7 +47,7 @@
         <w:tblLook w:val="04A0" w:firstRow="1" w:lastRow="0" w:firstColumn="1" w:lastColumn="0" w:noHBand="0" w:noVBand="1"/>
       </w:tblPr>
       <w:tblGrid>
-        <w:gridCol w:w="2586"/>
+        <w:gridCol w:w="3397"/>
         <w:gridCol w:w="2173"/>
       </w:tblGrid>
       <w:tr>
@@ -323,37 +343,64 @@
               <w:right w:w="180" w:type="dxa"/>
             </w:tcMar>
             <w:vAlign w:val="center"/>
-          </w:tcPr>
-          <w:p>
-            <w:pPr>
-              <w:spacing w:after="0" w:line="240" w:lineRule="auto"/>
-              <w:rPr>
-                <w:rFonts w:ascii="Arial" w:eastAsia="Times New Roman" w:hAnsi="Arial" w:cs="Arial"/>
-                <w:b/>
-                <w:bCs/>
-                <w:color w:val="000000"/>
-                <w:sz w:val="20"/>
-                <w:szCs w:val="20"/>
-              </w:rPr>
-            </w:pPr>
-            <w:commentRangeStart w:id="0"/>
-            <w:r>
-              <w:rPr>
-                <w:rFonts w:ascii="Arial" w:eastAsia="Times New Roman" w:hAnsi="Arial" w:cs="Arial"/>
-                <w:b/>
-                <w:bCs/>
-                <w:color w:val="000000"/>
-                <w:sz w:val="20"/>
-                <w:szCs w:val="20"/>
-              </w:rPr>
-              <w:t>Arterial lactate</w:t>
-            </w:r>
-            <w:commentRangeEnd w:id="0"/>
-            <w:r>
-              <w:rPr>
-                <w:rStyle w:val="CommentReference"/>
-              </w:rPr>
-              <w:commentReference w:id="0"/>
+            <w:hideMark/>
+          </w:tcPr>
+          <w:p>
+            <w:pPr>
+              <w:spacing w:after="0" w:line="240" w:lineRule="auto"/>
+              <w:rPr>
+                <w:rFonts w:ascii="Arial" w:eastAsia="Times New Roman" w:hAnsi="Arial" w:cs="Arial"/>
+                <w:b/>
+                <w:bCs/>
+                <w:color w:val="000000"/>
+                <w:sz w:val="20"/>
+                <w:szCs w:val="20"/>
+              </w:rPr>
+            </w:pPr>
+            <w:r>
+              <w:rPr>
+                <w:rFonts w:ascii="Arial" w:eastAsia="Times New Roman" w:hAnsi="Arial" w:cs="Arial"/>
+                <w:b/>
+                <w:bCs/>
+                <w:color w:val="000000"/>
+                <w:sz w:val="20"/>
+                <w:szCs w:val="20"/>
+              </w:rPr>
+              <w:t>A</w:t>
+            </w:r>
+            <w:r>
+              <w:rPr>
+                <w:rFonts w:ascii="Arial" w:eastAsia="Times New Roman" w:hAnsi="Arial" w:cs="Arial"/>
+                <w:b/>
+                <w:bCs/>
+                <w:color w:val="000000"/>
+                <w:sz w:val="20"/>
+                <w:szCs w:val="20"/>
+              </w:rPr>
+              <w:t>lbumin</w:t>
+            </w:r>
+            <w:r>
+              <w:rPr>
+                <w:rFonts w:ascii="Arial" w:eastAsia="Times New Roman" w:hAnsi="Arial" w:cs="Arial"/>
+                <w:b/>
+                <w:bCs/>
+                <w:color w:val="000000"/>
+                <w:sz w:val="20"/>
+                <w:szCs w:val="20"/>
+              </w:rPr>
+              <w:t xml:space="preserve"> (g/dL)</w:t>
+            </w:r>
+            <w:r>
+              <w:rPr>
+                <w:rFonts w:ascii="Arial" w:eastAsia="Times New Roman" w:hAnsi="Arial" w:cs="Arial"/>
+                <w:b/>
+                <w:bCs/>
+                <w:color w:val="000000"/>
+                <w:sz w:val="20"/>
+                <w:szCs w:val="20"/>
+                <w:vertAlign w:val="superscript"/>
+              </w:rPr>
+              <w:t>1</w:t>
             </w:r>
           </w:p>
         </w:tc>
@@ -375,6 +422,7 @@
               <w:right w:w="180" w:type="dxa"/>
             </w:tcMar>
             <w:vAlign w:val="center"/>
+            <w:hideMark/>
           </w:tcPr>
           <w:p>
             <w:pPr>
@@ -392,7 +440,7 @@
                 <w:sz w:val="20"/>
                 <w:szCs w:val="20"/>
               </w:rPr>
-              <w:t>1</w:t>
+              <w:t>4.1</w:t>
             </w:r>
           </w:p>
         </w:tc>
@@ -416,29 +464,64 @@
               <w:right w:w="180" w:type="dxa"/>
             </w:tcMar>
             <w:vAlign w:val="center"/>
-          </w:tcPr>
-          <w:p>
-            <w:pPr>
-              <w:spacing w:after="0" w:line="240" w:lineRule="auto"/>
-              <w:rPr>
-                <w:rFonts w:ascii="Arial" w:eastAsia="Times New Roman" w:hAnsi="Arial" w:cs="Arial"/>
-                <w:b/>
-                <w:bCs/>
-                <w:color w:val="000000"/>
-                <w:sz w:val="20"/>
-                <w:szCs w:val="20"/>
-              </w:rPr>
-            </w:pPr>
-            <w:r>
-              <w:rPr>
-                <w:rFonts w:ascii="Arial" w:eastAsia="Times New Roman" w:hAnsi="Arial" w:cs="Arial"/>
-                <w:b/>
-                <w:bCs/>
-                <w:color w:val="000000"/>
-                <w:sz w:val="20"/>
-                <w:szCs w:val="20"/>
-              </w:rPr>
-              <w:t>LDH</w:t>
+            <w:hideMark/>
+          </w:tcPr>
+          <w:p>
+            <w:pPr>
+              <w:spacing w:after="0" w:line="240" w:lineRule="auto"/>
+              <w:rPr>
+                <w:rFonts w:ascii="Arial" w:eastAsia="Times New Roman" w:hAnsi="Arial" w:cs="Arial"/>
+                <w:b/>
+                <w:bCs/>
+                <w:color w:val="000000"/>
+                <w:sz w:val="20"/>
+                <w:szCs w:val="20"/>
+              </w:rPr>
+            </w:pPr>
+            <w:r>
+              <w:rPr>
+                <w:rFonts w:ascii="Arial" w:eastAsia="Times New Roman" w:hAnsi="Arial" w:cs="Arial"/>
+                <w:b/>
+                <w:bCs/>
+                <w:color w:val="000000"/>
+                <w:sz w:val="20"/>
+                <w:szCs w:val="20"/>
+              </w:rPr>
+              <w:t>B</w:t>
+            </w:r>
+            <w:r>
+              <w:rPr>
+                <w:rFonts w:ascii="Arial" w:eastAsia="Times New Roman" w:hAnsi="Arial" w:cs="Arial"/>
+                <w:b/>
+                <w:bCs/>
+                <w:color w:val="000000"/>
+                <w:sz w:val="20"/>
+                <w:szCs w:val="20"/>
+              </w:rPr>
+              <w:t>ilirubin</w:t>
+            </w:r>
+            <w:r>
+              <w:rPr>
+                <w:rFonts w:ascii="Arial" w:eastAsia="Times New Roman" w:hAnsi="Arial" w:cs="Arial"/>
+                <w:b/>
+                <w:bCs/>
+                <w:color w:val="000000"/>
+                <w:sz w:val="20"/>
+                <w:szCs w:val="20"/>
+              </w:rPr>
+              <w:t xml:space="preserve"> (mg/dL) </w:t>
+            </w:r>
+            <w:r>
+              <w:rPr>
+                <w:rFonts w:ascii="Arial" w:eastAsia="Times New Roman" w:hAnsi="Arial" w:cs="Arial"/>
+                <w:b/>
+                <w:bCs/>
+                <w:color w:val="000000"/>
+                <w:sz w:val="20"/>
+                <w:szCs w:val="20"/>
+                <w:vertAlign w:val="superscript"/>
+              </w:rPr>
+              <w:t>1</w:t>
             </w:r>
           </w:p>
         </w:tc>
@@ -460,6 +543,7 @@
               <w:right w:w="180" w:type="dxa"/>
             </w:tcMar>
             <w:vAlign w:val="center"/>
+            <w:hideMark/>
           </w:tcPr>
           <w:p>
             <w:pPr>
@@ -477,7 +561,7 @@
                 <w:sz w:val="20"/>
                 <w:szCs w:val="20"/>
               </w:rPr>
-              <w:t>220</w:t>
+              <w:t>0.6</w:t>
             </w:r>
           </w:p>
         </w:tc>
@@ -501,29 +585,64 @@
               <w:right w:w="180" w:type="dxa"/>
             </w:tcMar>
             <w:vAlign w:val="center"/>
-          </w:tcPr>
-          <w:p>
-            <w:pPr>
-              <w:spacing w:after="0" w:line="240" w:lineRule="auto"/>
-              <w:rPr>
-                <w:rFonts w:ascii="Arial" w:eastAsia="Times New Roman" w:hAnsi="Arial" w:cs="Arial"/>
-                <w:b/>
-                <w:bCs/>
-                <w:color w:val="000000"/>
-                <w:sz w:val="20"/>
-                <w:szCs w:val="20"/>
-              </w:rPr>
-            </w:pPr>
-            <w:r>
-              <w:rPr>
-                <w:rFonts w:ascii="Arial" w:eastAsia="Times New Roman" w:hAnsi="Arial" w:cs="Arial"/>
-                <w:b/>
-                <w:bCs/>
-                <w:color w:val="000000"/>
-                <w:sz w:val="20"/>
-                <w:szCs w:val="20"/>
-              </w:rPr>
-              <w:t>Hemoglobin</w:t>
+            <w:hideMark/>
+          </w:tcPr>
+          <w:p>
+            <w:pPr>
+              <w:spacing w:after="0" w:line="240" w:lineRule="auto"/>
+              <w:rPr>
+                <w:rFonts w:ascii="Arial" w:eastAsia="Times New Roman" w:hAnsi="Arial" w:cs="Arial"/>
+                <w:b/>
+                <w:bCs/>
+                <w:color w:val="000000"/>
+                <w:sz w:val="20"/>
+                <w:szCs w:val="20"/>
+              </w:rPr>
+            </w:pPr>
+            <w:r>
+              <w:rPr>
+                <w:rFonts w:ascii="Arial" w:eastAsia="Times New Roman" w:hAnsi="Arial" w:cs="Arial"/>
+                <w:b/>
+                <w:bCs/>
+                <w:color w:val="000000"/>
+                <w:sz w:val="20"/>
+                <w:szCs w:val="20"/>
+              </w:rPr>
+              <w:t>C</w:t>
+            </w:r>
+            <w:r>
+              <w:rPr>
+                <w:rFonts w:ascii="Arial" w:eastAsia="Times New Roman" w:hAnsi="Arial" w:cs="Arial"/>
+                <w:b/>
+                <w:bCs/>
+                <w:color w:val="000000"/>
+                <w:sz w:val="20"/>
+                <w:szCs w:val="20"/>
+              </w:rPr>
+              <w:t>reatinine</w:t>
+            </w:r>
+            <w:r>
+              <w:rPr>
+                <w:rFonts w:ascii="Arial" w:eastAsia="Times New Roman" w:hAnsi="Arial" w:cs="Arial"/>
+                <w:b/>
+                <w:bCs/>
+                <w:color w:val="000000"/>
+                <w:sz w:val="20"/>
+                <w:szCs w:val="20"/>
+              </w:rPr>
+              <w:t xml:space="preserve"> (mg/dL)</w:t>
+            </w:r>
+            <w:r>
+              <w:rPr>
+                <w:rFonts w:ascii="Arial" w:eastAsia="Times New Roman" w:hAnsi="Arial" w:cs="Arial"/>
+                <w:b/>
+                <w:bCs/>
+                <w:color w:val="000000"/>
+                <w:sz w:val="20"/>
+                <w:szCs w:val="20"/>
+                <w:vertAlign w:val="superscript"/>
+              </w:rPr>
+              <w:t>1</w:t>
             </w:r>
           </w:p>
         </w:tc>
@@ -545,6 +664,7 @@
               <w:right w:w="180" w:type="dxa"/>
             </w:tcMar>
             <w:vAlign w:val="center"/>
+            <w:hideMark/>
           </w:tcPr>
           <w:p>
             <w:pPr>
@@ -562,26 +682,7 @@
                 <w:sz w:val="20"/>
                 <w:szCs w:val="20"/>
               </w:rPr>
-              <w:t>Male – 14.9</w:t>
-            </w:r>
-          </w:p>
-          <w:p>
-            <w:pPr>
-              <w:spacing w:after="0" w:line="240" w:lineRule="auto"/>
-              <w:jc w:val="center"/>
-              <w:rPr>
-                <w:rFonts w:ascii="Arial" w:eastAsia="Times New Roman" w:hAnsi="Arial" w:cs="Arial"/>
-                <w:sz w:val="20"/>
-                <w:szCs w:val="20"/>
-              </w:rPr>
-            </w:pPr>
-            <w:r>
-              <w:rPr>
-                <w:rFonts w:ascii="Arial" w:eastAsia="Times New Roman" w:hAnsi="Arial" w:cs="Arial"/>
-                <w:sz w:val="20"/>
-                <w:szCs w:val="20"/>
-              </w:rPr>
-              <w:t>Female – 13.3</w:t>
+              <w:t>1.2</w:t>
             </w:r>
           </w:p>
         </w:tc>
@@ -628,18 +729,29 @@
                 <w:sz w:val="20"/>
                 <w:szCs w:val="20"/>
               </w:rPr>
-              <w:t>A</w:t>
-            </w:r>
-            <w:r>
-              <w:rPr>
-                <w:rFonts w:ascii="Arial" w:eastAsia="Times New Roman" w:hAnsi="Arial" w:cs="Arial"/>
-                <w:b/>
-                <w:bCs/>
-                <w:color w:val="000000"/>
-                <w:sz w:val="20"/>
-                <w:szCs w:val="20"/>
-              </w:rPr>
-              <w:t>lbumin</w:t>
+              <w:t>S</w:t>
+            </w:r>
+            <w:r>
+              <w:rPr>
+                <w:rFonts w:ascii="Arial" w:eastAsia="Times New Roman" w:hAnsi="Arial" w:cs="Arial"/>
+                <w:b/>
+                <w:bCs/>
+                <w:color w:val="000000"/>
+                <w:sz w:val="20"/>
+                <w:szCs w:val="20"/>
+              </w:rPr>
+              <w:t>odium</w:t>
+            </w:r>
+            <w:r>
+              <w:rPr>
+                <w:rFonts w:ascii="Arial" w:eastAsia="Times New Roman" w:hAnsi="Arial" w:cs="Arial"/>
+                <w:b/>
+                <w:bCs/>
+                <w:color w:val="000000"/>
+                <w:sz w:val="20"/>
+                <w:szCs w:val="20"/>
+              </w:rPr>
+              <w:t xml:space="preserve"> (mEq/L) </w:t>
             </w:r>
             <w:r>
               <w:rPr>
@@ -691,7 +803,7 @@
                 <w:sz w:val="20"/>
                 <w:szCs w:val="20"/>
               </w:rPr>
-              <w:t>4.1</w:t>
+              <w:t>138.0</w:t>
             </w:r>
           </w:p>
         </w:tc>
@@ -738,18 +850,18 @@
                 <w:sz w:val="20"/>
                 <w:szCs w:val="20"/>
               </w:rPr>
-              <w:t>B</w:t>
-            </w:r>
-            <w:r>
-              <w:rPr>
-                <w:rFonts w:ascii="Arial" w:eastAsia="Times New Roman" w:hAnsi="Arial" w:cs="Arial"/>
-                <w:b/>
-                <w:bCs/>
-                <w:color w:val="000000"/>
-                <w:sz w:val="20"/>
-                <w:szCs w:val="20"/>
-              </w:rPr>
-              <w:t>ilirubin</w:t>
+              <w:t>BNP</w:t>
+            </w:r>
+            <w:r>
+              <w:rPr>
+                <w:rFonts w:ascii="Arial" w:eastAsia="Times New Roman" w:hAnsi="Arial" w:cs="Arial"/>
+                <w:b/>
+                <w:bCs/>
+                <w:color w:val="000000"/>
+                <w:sz w:val="20"/>
+                <w:szCs w:val="20"/>
+              </w:rPr>
+              <w:t xml:space="preserve"> (pg/mL) </w:t>
             </w:r>
             <w:r>
               <w:rPr>
@@ -801,7 +913,7 @@
                 <w:sz w:val="20"/>
                 <w:szCs w:val="20"/>
               </w:rPr>
-              <w:t>0.6</w:t>
+              <w:t>237</w:t>
             </w:r>
           </w:p>
         </w:tc>
@@ -825,41 +937,40 @@
               <w:right w:w="180" w:type="dxa"/>
             </w:tcMar>
             <w:vAlign w:val="center"/>
-            <w:hideMark/>
-          </w:tcPr>
-          <w:p>
-            <w:pPr>
-              <w:spacing w:after="0" w:line="240" w:lineRule="auto"/>
-              <w:rPr>
-                <w:rFonts w:ascii="Arial" w:eastAsia="Times New Roman" w:hAnsi="Arial" w:cs="Arial"/>
-                <w:b/>
-                <w:bCs/>
-                <w:color w:val="000000"/>
-                <w:sz w:val="20"/>
-                <w:szCs w:val="20"/>
-              </w:rPr>
-            </w:pPr>
-            <w:r>
-              <w:rPr>
-                <w:rFonts w:ascii="Arial" w:eastAsia="Times New Roman" w:hAnsi="Arial" w:cs="Arial"/>
-                <w:b/>
-                <w:bCs/>
-                <w:color w:val="000000"/>
-                <w:sz w:val="20"/>
-                <w:szCs w:val="20"/>
-              </w:rPr>
-              <w:t>C</w:t>
-            </w:r>
-            <w:r>
-              <w:rPr>
-                <w:rFonts w:ascii="Arial" w:eastAsia="Times New Roman" w:hAnsi="Arial" w:cs="Arial"/>
-                <w:b/>
-                <w:bCs/>
-                <w:color w:val="000000"/>
-                <w:sz w:val="20"/>
-                <w:szCs w:val="20"/>
-              </w:rPr>
-              <w:t>reatinine</w:t>
+          </w:tcPr>
+          <w:p>
+            <w:pPr>
+              <w:spacing w:after="0" w:line="240" w:lineRule="auto"/>
+              <w:rPr>
+                <w:rFonts w:ascii="Arial" w:eastAsia="Times New Roman" w:hAnsi="Arial" w:cs="Arial"/>
+                <w:b/>
+                <w:bCs/>
+                <w:color w:val="000000"/>
+                <w:sz w:val="20"/>
+                <w:szCs w:val="20"/>
+              </w:rPr>
+            </w:pPr>
+            <w:r>
+              <w:rPr>
+                <w:rFonts w:ascii="Arial" w:eastAsia="Times New Roman" w:hAnsi="Arial" w:cs="Arial"/>
+                <w:b/>
+                <w:bCs/>
+                <w:color w:val="000000"/>
+                <w:sz w:val="20"/>
+                <w:szCs w:val="20"/>
+              </w:rPr>
+              <w:t>BNP NT Pro</w:t>
+            </w:r>
+            <w:r>
+              <w:rPr>
+                <w:rFonts w:ascii="Arial" w:eastAsia="Times New Roman" w:hAnsi="Arial" w:cs="Arial"/>
+                <w:b/>
+                <w:bCs/>
+                <w:color w:val="000000"/>
+                <w:sz w:val="20"/>
+                <w:szCs w:val="20"/>
+              </w:rPr>
+              <w:t xml:space="preserve"> (pg/mL) </w:t>
             </w:r>
             <w:r>
               <w:rPr>
@@ -893,7 +1004,6 @@
               <w:right w:w="180" w:type="dxa"/>
             </w:tcMar>
             <w:vAlign w:val="center"/>
-            <w:hideMark/>
           </w:tcPr>
           <w:p>
             <w:pPr>
@@ -911,7 +1021,15 @@
                 <w:sz w:val="20"/>
                 <w:szCs w:val="20"/>
               </w:rPr>
-              <w:t>1.2</w:t>
+              <w:t>91</w:t>
+            </w:r>
+            <w:r>
+              <w:rPr>
+                <w:rFonts w:ascii="Arial" w:eastAsia="Times New Roman" w:hAnsi="Arial" w:cs="Arial"/>
+                <w:sz w:val="20"/>
+                <w:szCs w:val="20"/>
+              </w:rPr>
+              <w:t>2</w:t>
             </w:r>
           </w:p>
         </w:tc>
@@ -958,30 +1076,51 @@
                 <w:sz w:val="20"/>
                 <w:szCs w:val="20"/>
               </w:rPr>
-              <w:t>S</w:t>
-            </w:r>
-            <w:r>
-              <w:rPr>
-                <w:rFonts w:ascii="Arial" w:eastAsia="Times New Roman" w:hAnsi="Arial" w:cs="Arial"/>
-                <w:b/>
-                <w:bCs/>
-                <w:color w:val="000000"/>
-                <w:sz w:val="20"/>
-                <w:szCs w:val="20"/>
-              </w:rPr>
-              <w:t>odium</w:t>
-            </w:r>
-            <w:r>
-              <w:rPr>
-                <w:rFonts w:ascii="Arial" w:eastAsia="Times New Roman" w:hAnsi="Arial" w:cs="Arial"/>
-                <w:b/>
-                <w:bCs/>
-                <w:color w:val="000000"/>
-                <w:sz w:val="20"/>
-                <w:szCs w:val="20"/>
-                <w:vertAlign w:val="superscript"/>
-              </w:rPr>
-              <w:t>1</w:t>
+              <w:t>C</w:t>
+            </w:r>
+            <w:r>
+              <w:rPr>
+                <w:rFonts w:ascii="Arial" w:eastAsia="Times New Roman" w:hAnsi="Arial" w:cs="Arial"/>
+                <w:b/>
+                <w:bCs/>
+                <w:color w:val="000000"/>
+                <w:sz w:val="20"/>
+                <w:szCs w:val="20"/>
+              </w:rPr>
+              <w:t>ardiac</w:t>
+            </w:r>
+            <w:r>
+              <w:rPr>
+                <w:rFonts w:ascii="Arial" w:eastAsia="Times New Roman" w:hAnsi="Arial" w:cs="Arial"/>
+                <w:b/>
+                <w:bCs/>
+                <w:color w:val="000000"/>
+                <w:sz w:val="20"/>
+                <w:szCs w:val="20"/>
+              </w:rPr>
+              <w:t xml:space="preserve"> </w:t>
+            </w:r>
+            <w:r>
+              <w:rPr>
+                <w:rFonts w:ascii="Arial" w:eastAsia="Times New Roman" w:hAnsi="Arial" w:cs="Arial"/>
+                <w:b/>
+                <w:bCs/>
+                <w:color w:val="000000"/>
+                <w:sz w:val="20"/>
+                <w:szCs w:val="20"/>
+              </w:rPr>
+              <w:t>output</w:t>
+            </w:r>
+            <w:r>
+              <w:rPr>
+                <w:rFonts w:ascii="Arial" w:eastAsia="Times New Roman" w:hAnsi="Arial" w:cs="Arial"/>
+                <w:b/>
+                <w:bCs/>
+                <w:color w:val="000000"/>
+                <w:sz w:val="20"/>
+                <w:szCs w:val="20"/>
+              </w:rPr>
+              <w:t xml:space="preserve"> (L/min)</w:t>
             </w:r>
           </w:p>
         </w:tc>
@@ -1021,7 +1160,26 @@
                 <w:sz w:val="20"/>
                 <w:szCs w:val="20"/>
               </w:rPr>
-              <w:t>138.0</w:t>
+              <w:t>LVAD – 2.5*BSA</w:t>
+            </w:r>
+          </w:p>
+          <w:p>
+            <w:pPr>
+              <w:spacing w:after="0" w:line="240" w:lineRule="auto"/>
+              <w:jc w:val="center"/>
+              <w:rPr>
+                <w:rFonts w:ascii="Arial" w:eastAsia="Times New Roman" w:hAnsi="Arial" w:cs="Arial"/>
+                <w:sz w:val="20"/>
+                <w:szCs w:val="20"/>
+              </w:rPr>
+            </w:pPr>
+            <w:r>
+              <w:rPr>
+                <w:rFonts w:ascii="Arial" w:eastAsia="Times New Roman" w:hAnsi="Arial" w:cs="Arial"/>
+                <w:sz w:val="20"/>
+                <w:szCs w:val="20"/>
+              </w:rPr>
+              <w:t>No LVAD – 2.2*BSA</w:t>
             </w:r>
           </w:p>
         </w:tc>
@@ -1068,19 +1226,51 @@
                 <w:sz w:val="20"/>
                 <w:szCs w:val="20"/>
               </w:rPr>
-              <w:t>BNP</w:t>
-            </w:r>
-            <w:r>
-              <w:rPr>
-                <w:rFonts w:ascii="Arial" w:eastAsia="Times New Roman" w:hAnsi="Arial" w:cs="Arial"/>
-                <w:b/>
-                <w:bCs/>
-                <w:color w:val="000000"/>
-                <w:sz w:val="20"/>
-                <w:szCs w:val="20"/>
-                <w:vertAlign w:val="superscript"/>
-              </w:rPr>
-              <w:t>1</w:t>
+              <w:t>D</w:t>
+            </w:r>
+            <w:r>
+              <w:rPr>
+                <w:rFonts w:ascii="Arial" w:eastAsia="Times New Roman" w:hAnsi="Arial" w:cs="Arial"/>
+                <w:b/>
+                <w:bCs/>
+                <w:color w:val="000000"/>
+                <w:sz w:val="20"/>
+                <w:szCs w:val="20"/>
+              </w:rPr>
+              <w:t>iastolic</w:t>
+            </w:r>
+            <w:r>
+              <w:rPr>
+                <w:rFonts w:ascii="Arial" w:eastAsia="Times New Roman" w:hAnsi="Arial" w:cs="Arial"/>
+                <w:b/>
+                <w:bCs/>
+                <w:color w:val="000000"/>
+                <w:sz w:val="20"/>
+                <w:szCs w:val="20"/>
+              </w:rPr>
+              <w:t xml:space="preserve"> </w:t>
+            </w:r>
+            <w:r>
+              <w:rPr>
+                <w:rFonts w:ascii="Arial" w:eastAsia="Times New Roman" w:hAnsi="Arial" w:cs="Arial"/>
+                <w:b/>
+                <w:bCs/>
+                <w:color w:val="000000"/>
+                <w:sz w:val="20"/>
+                <w:szCs w:val="20"/>
+              </w:rPr>
+              <w:t>BP</w:t>
+            </w:r>
+            <w:r>
+              <w:rPr>
+                <w:rFonts w:ascii="Arial" w:eastAsia="Times New Roman" w:hAnsi="Arial" w:cs="Arial"/>
+                <w:b/>
+                <w:bCs/>
+                <w:color w:val="000000"/>
+                <w:sz w:val="20"/>
+                <w:szCs w:val="20"/>
+              </w:rPr>
+              <w:t xml:space="preserve"> (mmHg)</w:t>
             </w:r>
           </w:p>
         </w:tc>
@@ -1120,7 +1310,7 @@
                 <w:sz w:val="20"/>
                 <w:szCs w:val="20"/>
               </w:rPr>
-              <w:t>237</w:t>
+              <w:t>80</w:t>
             </w:r>
           </w:p>
         </w:tc>
@@ -1144,41 +1334,74 @@
               <w:right w:w="180" w:type="dxa"/>
             </w:tcMar>
             <w:vAlign w:val="center"/>
-          </w:tcPr>
-          <w:p>
-            <w:pPr>
-              <w:spacing w:after="0" w:line="240" w:lineRule="auto"/>
-              <w:rPr>
-                <w:rFonts w:ascii="Arial" w:eastAsia="Times New Roman" w:hAnsi="Arial" w:cs="Arial"/>
-                <w:b/>
-                <w:bCs/>
-                <w:color w:val="000000"/>
-                <w:sz w:val="20"/>
-                <w:szCs w:val="20"/>
-              </w:rPr>
-            </w:pPr>
-            <w:r>
-              <w:rPr>
-                <w:rFonts w:ascii="Arial" w:eastAsia="Times New Roman" w:hAnsi="Arial" w:cs="Arial"/>
-                <w:b/>
-                <w:bCs/>
-                <w:color w:val="000000"/>
-                <w:sz w:val="20"/>
-                <w:szCs w:val="20"/>
-              </w:rPr>
-              <w:t>BNP NT Pro</w:t>
-            </w:r>
-            <w:r>
-              <w:rPr>
-                <w:rFonts w:ascii="Arial" w:eastAsia="Times New Roman" w:hAnsi="Arial" w:cs="Arial"/>
-                <w:b/>
-                <w:bCs/>
-                <w:color w:val="000000"/>
-                <w:sz w:val="20"/>
-                <w:szCs w:val="20"/>
-                <w:vertAlign w:val="superscript"/>
-              </w:rPr>
-              <w:t>1</w:t>
+            <w:hideMark/>
+          </w:tcPr>
+          <w:p>
+            <w:pPr>
+              <w:spacing w:after="0" w:line="240" w:lineRule="auto"/>
+              <w:rPr>
+                <w:rFonts w:ascii="Arial" w:eastAsia="Times New Roman" w:hAnsi="Arial" w:cs="Arial"/>
+                <w:b/>
+                <w:bCs/>
+                <w:color w:val="000000"/>
+                <w:sz w:val="20"/>
+                <w:szCs w:val="20"/>
+              </w:rPr>
+            </w:pPr>
+            <w:r>
+              <w:rPr>
+                <w:rFonts w:ascii="Arial" w:eastAsia="Times New Roman" w:hAnsi="Arial" w:cs="Arial"/>
+                <w:b/>
+                <w:bCs/>
+                <w:color w:val="000000"/>
+                <w:sz w:val="20"/>
+                <w:szCs w:val="20"/>
+              </w:rPr>
+              <w:t>S</w:t>
+            </w:r>
+            <w:r>
+              <w:rPr>
+                <w:rFonts w:ascii="Arial" w:eastAsia="Times New Roman" w:hAnsi="Arial" w:cs="Arial"/>
+                <w:b/>
+                <w:bCs/>
+                <w:color w:val="000000"/>
+                <w:sz w:val="20"/>
+                <w:szCs w:val="20"/>
+              </w:rPr>
+              <w:t>ystolic</w:t>
+            </w:r>
+            <w:r>
+              <w:rPr>
+                <w:rFonts w:ascii="Arial" w:eastAsia="Times New Roman" w:hAnsi="Arial" w:cs="Arial"/>
+                <w:b/>
+                <w:bCs/>
+                <w:color w:val="000000"/>
+                <w:sz w:val="20"/>
+                <w:szCs w:val="20"/>
+              </w:rPr>
+              <w:t xml:space="preserve"> </w:t>
+            </w:r>
+            <w:r>
+              <w:rPr>
+                <w:rFonts w:ascii="Arial" w:eastAsia="Times New Roman" w:hAnsi="Arial" w:cs="Arial"/>
+                <w:b/>
+                <w:bCs/>
+                <w:color w:val="000000"/>
+                <w:sz w:val="20"/>
+                <w:szCs w:val="20"/>
+              </w:rPr>
+              <w:t>BP</w:t>
+            </w:r>
+            <w:r>
+              <w:rPr>
+                <w:rFonts w:ascii="Arial" w:eastAsia="Times New Roman" w:hAnsi="Arial" w:cs="Arial"/>
+                <w:b/>
+                <w:bCs/>
+                <w:color w:val="000000"/>
+                <w:sz w:val="20"/>
+                <w:szCs w:val="20"/>
+              </w:rPr>
+              <w:t xml:space="preserve"> (mmHg)</w:t>
             </w:r>
           </w:p>
         </w:tc>
@@ -1200,6 +1423,7 @@
               <w:right w:w="180" w:type="dxa"/>
             </w:tcMar>
             <w:vAlign w:val="center"/>
+            <w:hideMark/>
           </w:tcPr>
           <w:p>
             <w:pPr>
@@ -1217,7 +1441,26 @@
                 <w:sz w:val="20"/>
                 <w:szCs w:val="20"/>
               </w:rPr>
-              <w:t>914</w:t>
+              <w:t>LVAD – 100</w:t>
+            </w:r>
+          </w:p>
+          <w:p>
+            <w:pPr>
+              <w:spacing w:after="0" w:line="240" w:lineRule="auto"/>
+              <w:jc w:val="center"/>
+              <w:rPr>
+                <w:rFonts w:ascii="Arial" w:eastAsia="Times New Roman" w:hAnsi="Arial" w:cs="Arial"/>
+                <w:sz w:val="20"/>
+                <w:szCs w:val="20"/>
+              </w:rPr>
+            </w:pPr>
+            <w:r>
+              <w:rPr>
+                <w:rFonts w:ascii="Arial" w:eastAsia="Times New Roman" w:hAnsi="Arial" w:cs="Arial"/>
+                <w:sz w:val="20"/>
+                <w:szCs w:val="20"/>
+              </w:rPr>
+              <w:t>No LVAD – 110</w:t>
             </w:r>
           </w:p>
         </w:tc>
@@ -1264,40 +1507,18 @@
                 <w:sz w:val="20"/>
                 <w:szCs w:val="20"/>
               </w:rPr>
-              <w:t>C</w:t>
-            </w:r>
-            <w:r>
-              <w:rPr>
-                <w:rFonts w:ascii="Arial" w:eastAsia="Times New Roman" w:hAnsi="Arial" w:cs="Arial"/>
-                <w:b/>
-                <w:bCs/>
-                <w:color w:val="000000"/>
-                <w:sz w:val="20"/>
-                <w:szCs w:val="20"/>
-              </w:rPr>
-              <w:t>ardiac</w:t>
-            </w:r>
-            <w:r>
-              <w:rPr>
-                <w:rFonts w:ascii="Arial" w:eastAsia="Times New Roman" w:hAnsi="Arial" w:cs="Arial"/>
-                <w:b/>
-                <w:bCs/>
-                <w:color w:val="000000"/>
-                <w:sz w:val="20"/>
-                <w:szCs w:val="20"/>
-              </w:rPr>
-              <w:t xml:space="preserve"> </w:t>
-            </w:r>
-            <w:r>
-              <w:rPr>
-                <w:rFonts w:ascii="Arial" w:eastAsia="Times New Roman" w:hAnsi="Arial" w:cs="Arial"/>
-                <w:b/>
-                <w:bCs/>
-                <w:color w:val="000000"/>
-                <w:sz w:val="20"/>
-                <w:szCs w:val="20"/>
-              </w:rPr>
-              <w:t>output</w:t>
+              <w:t>PCWP</w:t>
+            </w:r>
+            <w:r>
+              <w:rPr>
+                <w:rFonts w:ascii="Arial" w:eastAsia="Times New Roman" w:hAnsi="Arial" w:cs="Arial"/>
+                <w:b/>
+                <w:bCs/>
+                <w:color w:val="000000"/>
+                <w:sz w:val="20"/>
+                <w:szCs w:val="20"/>
+              </w:rPr>
+              <w:t xml:space="preserve"> (mmHg)</w:t>
             </w:r>
           </w:p>
         </w:tc>
@@ -1337,7 +1558,7 @@
                 <w:sz w:val="20"/>
                 <w:szCs w:val="20"/>
               </w:rPr>
-              <w:t>LVAD – 2.5*BSA</w:t>
+              <w:t>LVAD – 15</w:t>
             </w:r>
           </w:p>
           <w:p>
@@ -1356,7 +1577,7 @@
                 <w:sz w:val="20"/>
                 <w:szCs w:val="20"/>
               </w:rPr>
-              <w:t>No LVAD – 2.2*BSA</w:t>
+              <w:t>No LVAD – 18</w:t>
             </w:r>
           </w:p>
         </w:tc>
@@ -1403,40 +1624,18 @@
                 <w:sz w:val="20"/>
                 <w:szCs w:val="20"/>
               </w:rPr>
-              <w:t>D</w:t>
-            </w:r>
-            <w:r>
-              <w:rPr>
-                <w:rFonts w:ascii="Arial" w:eastAsia="Times New Roman" w:hAnsi="Arial" w:cs="Arial"/>
-                <w:b/>
-                <w:bCs/>
-                <w:color w:val="000000"/>
-                <w:sz w:val="20"/>
-                <w:szCs w:val="20"/>
-              </w:rPr>
-              <w:t>iastolic</w:t>
-            </w:r>
-            <w:r>
-              <w:rPr>
-                <w:rFonts w:ascii="Arial" w:eastAsia="Times New Roman" w:hAnsi="Arial" w:cs="Arial"/>
-                <w:b/>
-                <w:bCs/>
-                <w:color w:val="000000"/>
-                <w:sz w:val="20"/>
-                <w:szCs w:val="20"/>
-              </w:rPr>
-              <w:t xml:space="preserve"> </w:t>
-            </w:r>
-            <w:r>
-              <w:rPr>
-                <w:rFonts w:ascii="Arial" w:eastAsia="Times New Roman" w:hAnsi="Arial" w:cs="Arial"/>
-                <w:b/>
-                <w:bCs/>
-                <w:color w:val="000000"/>
-                <w:sz w:val="20"/>
-                <w:szCs w:val="20"/>
-              </w:rPr>
-              <w:t>BP</w:t>
+              <w:t>PASP</w:t>
+            </w:r>
+            <w:r>
+              <w:rPr>
+                <w:rFonts w:ascii="Arial" w:eastAsia="Times New Roman" w:hAnsi="Arial" w:cs="Arial"/>
+                <w:b/>
+                <w:bCs/>
+                <w:color w:val="000000"/>
+                <w:sz w:val="20"/>
+                <w:szCs w:val="20"/>
+              </w:rPr>
+              <w:t xml:space="preserve"> (mmHg)</w:t>
             </w:r>
           </w:p>
         </w:tc>
@@ -1476,7 +1675,26 @@
                 <w:sz w:val="20"/>
                 <w:szCs w:val="20"/>
               </w:rPr>
-              <w:t>80</w:t>
+              <w:t>LVAD – 35</w:t>
+            </w:r>
+          </w:p>
+          <w:p>
+            <w:pPr>
+              <w:spacing w:after="0" w:line="240" w:lineRule="auto"/>
+              <w:jc w:val="center"/>
+              <w:rPr>
+                <w:rFonts w:ascii="Arial" w:eastAsia="Times New Roman" w:hAnsi="Arial" w:cs="Arial"/>
+                <w:sz w:val="20"/>
+                <w:szCs w:val="20"/>
+              </w:rPr>
+            </w:pPr>
+            <w:r>
+              <w:rPr>
+                <w:rFonts w:ascii="Arial" w:eastAsia="Times New Roman" w:hAnsi="Arial" w:cs="Arial"/>
+                <w:sz w:val="20"/>
+                <w:szCs w:val="20"/>
+              </w:rPr>
+              <w:t>No LVAD – 38</w:t>
             </w:r>
           </w:p>
         </w:tc>
@@ -1523,40 +1741,18 @@
                 <w:sz w:val="20"/>
                 <w:szCs w:val="20"/>
               </w:rPr>
-              <w:t>S</w:t>
-            </w:r>
-            <w:r>
-              <w:rPr>
-                <w:rFonts w:ascii="Arial" w:eastAsia="Times New Roman" w:hAnsi="Arial" w:cs="Arial"/>
-                <w:b/>
-                <w:bCs/>
-                <w:color w:val="000000"/>
-                <w:sz w:val="20"/>
-                <w:szCs w:val="20"/>
-              </w:rPr>
-              <w:t>ystolic</w:t>
-            </w:r>
-            <w:r>
-              <w:rPr>
-                <w:rFonts w:ascii="Arial" w:eastAsia="Times New Roman" w:hAnsi="Arial" w:cs="Arial"/>
-                <w:b/>
-                <w:bCs/>
-                <w:color w:val="000000"/>
-                <w:sz w:val="20"/>
-                <w:szCs w:val="20"/>
-              </w:rPr>
-              <w:t xml:space="preserve"> </w:t>
-            </w:r>
-            <w:r>
-              <w:rPr>
-                <w:rFonts w:ascii="Arial" w:eastAsia="Times New Roman" w:hAnsi="Arial" w:cs="Arial"/>
-                <w:b/>
-                <w:bCs/>
-                <w:color w:val="000000"/>
-                <w:sz w:val="20"/>
-                <w:szCs w:val="20"/>
-              </w:rPr>
-              <w:t>BP</w:t>
+              <w:t>PADP</w:t>
+            </w:r>
+            <w:r>
+              <w:rPr>
+                <w:rFonts w:ascii="Arial" w:eastAsia="Times New Roman" w:hAnsi="Arial" w:cs="Arial"/>
+                <w:b/>
+                <w:bCs/>
+                <w:color w:val="000000"/>
+                <w:sz w:val="20"/>
+                <w:szCs w:val="20"/>
+              </w:rPr>
+              <w:t xml:space="preserve"> (mmHg)</w:t>
             </w:r>
           </w:p>
         </w:tc>
@@ -1596,7 +1792,7 @@
                 <w:sz w:val="20"/>
                 <w:szCs w:val="20"/>
               </w:rPr>
-              <w:t>LVAD – 100</w:t>
+              <w:t>LVAD – 15</w:t>
             </w:r>
           </w:p>
           <w:p>
@@ -1615,7 +1811,7 @@
                 <w:sz w:val="20"/>
                 <w:szCs w:val="20"/>
               </w:rPr>
-              <w:t>No LVAD – 110</w:t>
+              <w:t>No LVAD – 18</w:t>
             </w:r>
           </w:p>
         </w:tc>
@@ -1627,7 +1823,7 @@
             <w:tcBorders>
               <w:top w:val="nil"/>
               <w:left w:val="nil"/>
-              <w:bottom w:val="nil"/>
+              <w:bottom w:val="single" w:sz="18" w:space="0" w:color="auto"/>
               <w:right w:val="nil"/>
             </w:tcBorders>
             <w:shd w:val="clear" w:color="auto" w:fill="FFFFFF"/>
@@ -1662,324 +1858,6 @@
                 <w:sz w:val="20"/>
                 <w:szCs w:val="20"/>
               </w:rPr>
-              <w:t>PCWP</w:t>
-            </w:r>
-          </w:p>
-        </w:tc>
-        <w:tc>
-          <w:tcPr>
-            <w:tcW w:w="0" w:type="auto"/>
-            <w:tcBorders>
-              <w:top w:val="nil"/>
-              <w:left w:val="nil"/>
-              <w:bottom w:val="nil"/>
-              <w:right w:val="nil"/>
-            </w:tcBorders>
-            <w:shd w:val="clear" w:color="auto" w:fill="FFFFFF"/>
-            <w:noWrap/>
-            <w:tcMar>
-              <w:top w:w="60" w:type="dxa"/>
-              <w:left w:w="180" w:type="dxa"/>
-              <w:bottom w:w="60" w:type="dxa"/>
-              <w:right w:w="180" w:type="dxa"/>
-            </w:tcMar>
-            <w:vAlign w:val="center"/>
-            <w:hideMark/>
-          </w:tcPr>
-          <w:p>
-            <w:pPr>
-              <w:spacing w:after="0" w:line="240" w:lineRule="auto"/>
-              <w:jc w:val="center"/>
-              <w:rPr>
-                <w:rFonts w:ascii="Arial" w:eastAsia="Times New Roman" w:hAnsi="Arial" w:cs="Arial"/>
-                <w:sz w:val="20"/>
-                <w:szCs w:val="20"/>
-              </w:rPr>
-            </w:pPr>
-            <w:r>
-              <w:rPr>
-                <w:rFonts w:ascii="Arial" w:eastAsia="Times New Roman" w:hAnsi="Arial" w:cs="Arial"/>
-                <w:sz w:val="20"/>
-                <w:szCs w:val="20"/>
-              </w:rPr>
-              <w:t>LVAD – 15</w:t>
-            </w:r>
-          </w:p>
-          <w:p>
-            <w:pPr>
-              <w:spacing w:after="0" w:line="240" w:lineRule="auto"/>
-              <w:jc w:val="center"/>
-              <w:rPr>
-                <w:rFonts w:ascii="Arial" w:eastAsia="Times New Roman" w:hAnsi="Arial" w:cs="Arial"/>
-                <w:sz w:val="20"/>
-                <w:szCs w:val="20"/>
-              </w:rPr>
-            </w:pPr>
-            <w:r>
-              <w:rPr>
-                <w:rFonts w:ascii="Arial" w:eastAsia="Times New Roman" w:hAnsi="Arial" w:cs="Arial"/>
-                <w:sz w:val="20"/>
-                <w:szCs w:val="20"/>
-              </w:rPr>
-              <w:t>No LVAD – 18</w:t>
-            </w:r>
-          </w:p>
-        </w:tc>
-      </w:tr>
-      <w:tr>
-        <w:tc>
-          <w:tcPr>
-            <w:tcW w:w="0" w:type="auto"/>
-            <w:tcBorders>
-              <w:top w:val="nil"/>
-              <w:left w:val="nil"/>
-              <w:bottom w:val="nil"/>
-              <w:right w:val="nil"/>
-            </w:tcBorders>
-            <w:shd w:val="clear" w:color="auto" w:fill="FFFFFF"/>
-            <w:noWrap/>
-            <w:tcMar>
-              <w:top w:w="60" w:type="dxa"/>
-              <w:left w:w="60" w:type="dxa"/>
-              <w:bottom w:w="60" w:type="dxa"/>
-              <w:right w:w="180" w:type="dxa"/>
-            </w:tcMar>
-            <w:vAlign w:val="center"/>
-            <w:hideMark/>
-          </w:tcPr>
-          <w:p>
-            <w:pPr>
-              <w:spacing w:after="0" w:line="240" w:lineRule="auto"/>
-              <w:rPr>
-                <w:rFonts w:ascii="Arial" w:eastAsia="Times New Roman" w:hAnsi="Arial" w:cs="Arial"/>
-                <w:b/>
-                <w:bCs/>
-                <w:color w:val="000000"/>
-                <w:sz w:val="20"/>
-                <w:szCs w:val="20"/>
-              </w:rPr>
-            </w:pPr>
-            <w:r>
-              <w:rPr>
-                <w:rFonts w:ascii="Arial" w:eastAsia="Times New Roman" w:hAnsi="Arial" w:cs="Arial"/>
-                <w:b/>
-                <w:bCs/>
-                <w:color w:val="000000"/>
-                <w:sz w:val="20"/>
-                <w:szCs w:val="20"/>
-              </w:rPr>
-              <w:t>PASP</w:t>
-            </w:r>
-          </w:p>
-        </w:tc>
-        <w:tc>
-          <w:tcPr>
-            <w:tcW w:w="0" w:type="auto"/>
-            <w:tcBorders>
-              <w:top w:val="nil"/>
-              <w:left w:val="nil"/>
-              <w:bottom w:val="nil"/>
-              <w:right w:val="nil"/>
-            </w:tcBorders>
-            <w:shd w:val="clear" w:color="auto" w:fill="FFFFFF"/>
-            <w:noWrap/>
-            <w:tcMar>
-              <w:top w:w="60" w:type="dxa"/>
-              <w:left w:w="180" w:type="dxa"/>
-              <w:bottom w:w="60" w:type="dxa"/>
-              <w:right w:w="180" w:type="dxa"/>
-            </w:tcMar>
-            <w:vAlign w:val="center"/>
-            <w:hideMark/>
-          </w:tcPr>
-          <w:p>
-            <w:pPr>
-              <w:spacing w:after="0" w:line="240" w:lineRule="auto"/>
-              <w:jc w:val="center"/>
-              <w:rPr>
-                <w:rFonts w:ascii="Arial" w:eastAsia="Times New Roman" w:hAnsi="Arial" w:cs="Arial"/>
-                <w:sz w:val="20"/>
-                <w:szCs w:val="20"/>
-              </w:rPr>
-            </w:pPr>
-            <w:r>
-              <w:rPr>
-                <w:rFonts w:ascii="Arial" w:eastAsia="Times New Roman" w:hAnsi="Arial" w:cs="Arial"/>
-                <w:sz w:val="20"/>
-                <w:szCs w:val="20"/>
-              </w:rPr>
-              <w:t>LVAD – 35</w:t>
-            </w:r>
-          </w:p>
-          <w:p>
-            <w:pPr>
-              <w:spacing w:after="0" w:line="240" w:lineRule="auto"/>
-              <w:jc w:val="center"/>
-              <w:rPr>
-                <w:rFonts w:ascii="Arial" w:eastAsia="Times New Roman" w:hAnsi="Arial" w:cs="Arial"/>
-                <w:sz w:val="20"/>
-                <w:szCs w:val="20"/>
-              </w:rPr>
-            </w:pPr>
-            <w:r>
-              <w:rPr>
-                <w:rFonts w:ascii="Arial" w:eastAsia="Times New Roman" w:hAnsi="Arial" w:cs="Arial"/>
-                <w:sz w:val="20"/>
-                <w:szCs w:val="20"/>
-              </w:rPr>
-              <w:t>No LVAD – 38</w:t>
-            </w:r>
-          </w:p>
-        </w:tc>
-      </w:tr>
-      <w:tr>
-        <w:tc>
-          <w:tcPr>
-            <w:tcW w:w="0" w:type="auto"/>
-            <w:tcBorders>
-              <w:top w:val="nil"/>
-              <w:left w:val="nil"/>
-              <w:bottom w:val="nil"/>
-              <w:right w:val="nil"/>
-            </w:tcBorders>
-            <w:shd w:val="clear" w:color="auto" w:fill="FFFFFF"/>
-            <w:noWrap/>
-            <w:tcMar>
-              <w:top w:w="60" w:type="dxa"/>
-              <w:left w:w="60" w:type="dxa"/>
-              <w:bottom w:w="60" w:type="dxa"/>
-              <w:right w:w="180" w:type="dxa"/>
-            </w:tcMar>
-            <w:vAlign w:val="center"/>
-            <w:hideMark/>
-          </w:tcPr>
-          <w:p>
-            <w:pPr>
-              <w:spacing w:after="0" w:line="240" w:lineRule="auto"/>
-              <w:rPr>
-                <w:rFonts w:ascii="Arial" w:eastAsia="Times New Roman" w:hAnsi="Arial" w:cs="Arial"/>
-                <w:b/>
-                <w:bCs/>
-                <w:color w:val="000000"/>
-                <w:sz w:val="20"/>
-                <w:szCs w:val="20"/>
-              </w:rPr>
-            </w:pPr>
-            <w:r>
-              <w:rPr>
-                <w:rFonts w:ascii="Arial" w:eastAsia="Times New Roman" w:hAnsi="Arial" w:cs="Arial"/>
-                <w:b/>
-                <w:bCs/>
-                <w:color w:val="000000"/>
-                <w:sz w:val="20"/>
-                <w:szCs w:val="20"/>
-              </w:rPr>
-              <w:t>PADP</w:t>
-            </w:r>
-          </w:p>
-        </w:tc>
-        <w:tc>
-          <w:tcPr>
-            <w:tcW w:w="0" w:type="auto"/>
-            <w:tcBorders>
-              <w:top w:val="nil"/>
-              <w:left w:val="nil"/>
-              <w:bottom w:val="nil"/>
-              <w:right w:val="nil"/>
-            </w:tcBorders>
-            <w:shd w:val="clear" w:color="auto" w:fill="FFFFFF"/>
-            <w:noWrap/>
-            <w:tcMar>
-              <w:top w:w="60" w:type="dxa"/>
-              <w:left w:w="180" w:type="dxa"/>
-              <w:bottom w:w="60" w:type="dxa"/>
-              <w:right w:w="180" w:type="dxa"/>
-            </w:tcMar>
-            <w:vAlign w:val="center"/>
-            <w:hideMark/>
-          </w:tcPr>
-          <w:p>
-            <w:pPr>
-              <w:spacing w:after="0" w:line="240" w:lineRule="auto"/>
-              <w:jc w:val="center"/>
-              <w:rPr>
-                <w:rFonts w:ascii="Arial" w:eastAsia="Times New Roman" w:hAnsi="Arial" w:cs="Arial"/>
-                <w:sz w:val="20"/>
-                <w:szCs w:val="20"/>
-              </w:rPr>
-            </w:pPr>
-            <w:r>
-              <w:rPr>
-                <w:rFonts w:ascii="Arial" w:eastAsia="Times New Roman" w:hAnsi="Arial" w:cs="Arial"/>
-                <w:sz w:val="20"/>
-                <w:szCs w:val="20"/>
-              </w:rPr>
-              <w:t>LVAD – 15</w:t>
-            </w:r>
-          </w:p>
-          <w:p>
-            <w:pPr>
-              <w:spacing w:after="0" w:line="240" w:lineRule="auto"/>
-              <w:jc w:val="center"/>
-              <w:rPr>
-                <w:rFonts w:ascii="Arial" w:eastAsia="Times New Roman" w:hAnsi="Arial" w:cs="Arial"/>
-                <w:sz w:val="20"/>
-                <w:szCs w:val="20"/>
-              </w:rPr>
-            </w:pPr>
-            <w:r>
-              <w:rPr>
-                <w:rFonts w:ascii="Arial" w:eastAsia="Times New Roman" w:hAnsi="Arial" w:cs="Arial"/>
-                <w:sz w:val="20"/>
-                <w:szCs w:val="20"/>
-              </w:rPr>
-              <w:t>No LVAD – 18</w:t>
-            </w:r>
-          </w:p>
-        </w:tc>
-      </w:tr>
-      <w:tr>
-        <w:tc>
-          <w:tcPr>
-            <w:tcW w:w="0" w:type="auto"/>
-            <w:tcBorders>
-              <w:top w:val="nil"/>
-              <w:left w:val="nil"/>
-              <w:bottom w:val="single" w:sz="18" w:space="0" w:color="auto"/>
-              <w:right w:val="nil"/>
-            </w:tcBorders>
-            <w:shd w:val="clear" w:color="auto" w:fill="FFFFFF"/>
-            <w:noWrap/>
-            <w:tcMar>
-              <w:top w:w="60" w:type="dxa"/>
-              <w:left w:w="60" w:type="dxa"/>
-              <w:bottom w:w="60" w:type="dxa"/>
-              <w:right w:w="180" w:type="dxa"/>
-            </w:tcMar>
-            <w:vAlign w:val="center"/>
-            <w:hideMark/>
-          </w:tcPr>
-          <w:p>
-            <w:pPr>
-              <w:spacing w:after="0" w:line="240" w:lineRule="auto"/>
-              <w:rPr>
-                <w:rFonts w:ascii="Arial" w:eastAsia="Times New Roman" w:hAnsi="Arial" w:cs="Arial"/>
-                <w:b/>
-                <w:bCs/>
-                <w:color w:val="000000"/>
-                <w:sz w:val="20"/>
-                <w:szCs w:val="20"/>
-              </w:rPr>
-            </w:pPr>
-            <w:r>
-              <w:rPr>
-                <w:rFonts w:ascii="Arial" w:eastAsia="Times New Roman" w:hAnsi="Arial" w:cs="Arial"/>
-                <w:b/>
-                <w:bCs/>
-                <w:color w:val="000000"/>
-                <w:sz w:val="20"/>
-                <w:szCs w:val="20"/>
-              </w:rPr>
               <w:t>C</w:t>
             </w:r>
             <w:r>
@@ -2036,6 +1914,17 @@
                 <w:szCs w:val="20"/>
               </w:rPr>
               <w:t>pressure</w:t>
+            </w:r>
+            <w:r>
+              <w:rPr>
+                <w:rFonts w:ascii="Arial" w:eastAsia="Times New Roman" w:hAnsi="Arial" w:cs="Arial"/>
+                <w:b/>
+                <w:bCs/>
+                <w:color w:val="000000"/>
+                <w:sz w:val="20"/>
+                <w:szCs w:val="20"/>
+              </w:rPr>
+              <w:t xml:space="preserve"> (mmHg)</w:t>
             </w:r>
           </w:p>
         </w:tc>
@@ -2101,16 +1990,31 @@
       </w:tr>
     </w:tbl>
     <w:p>
-      <w:commentRangeStart w:id="2"/>
       <w:r>
-        <w:t>*Median from cohort data</w:t>
+        <w:rPr>
+          <w:vertAlign w:val="superscript"/>
+        </w:rPr>
+        <w:t>1</w:t>
       </w:r>
-      <w:commentRangeEnd w:id="2"/>
+      <w:commentRangeStart w:id="1"/>
+      <w:r>
+        <w:t>Sample m</w:t>
+      </w:r>
+      <w:r>
+        <w:t xml:space="preserve">edian from </w:t>
+      </w:r>
+      <w:r>
+        <w:t>all 2019-2023</w:t>
+      </w:r>
+      <w:r>
+        <w:t xml:space="preserve"> data</w:t>
+      </w:r>
+      <w:commentRangeEnd w:id="1"/>
       <w:r>
         <w:rPr>
           <w:rStyle w:val="CommentReference"/>
         </w:rPr>
-        <w:commentReference w:id="2"/>
+        <w:commentReference w:id="1"/>
       </w:r>
     </w:p>
     <w:p/>
@@ -2126,25 +2030,7 @@
 
 <file path=word/comments.xml><?xml version="1.0" encoding="utf-8"?>
 <w:comments xmlns:wpc="http://schemas.microsoft.com/office/word/2010/wordprocessingCanvas" xmlns:cx="http://schemas.microsoft.com/office/drawing/2014/chartex" xmlns:cx1="http://schemas.microsoft.com/office/drawing/2015/9/8/chartex" xmlns:cx2="http://schemas.microsoft.com/office/drawing/2015/10/21/chartex" xmlns:cx3="http://schemas.microsoft.com/office/drawing/2016/5/9/chartex" xmlns:cx4="http://schemas.microsoft.com/office/drawing/2016/5/10/chartex" xmlns:cx5="http://schemas.microsoft.com/office/drawing/2016/5/11/chartex" xmlns:cx6="http://schemas.microsoft.com/office/drawing/2016/5/12/chartex" xmlns:cx7="http://schemas.microsoft.com/office/drawing/2016/5/13/chartex" xmlns:cx8="http://schemas.microsoft.com/office/drawing/2016/5/14/chartex" xmlns:mc="http://schemas.openxmlformats.org/markup-compatibility/2006" xmlns:aink="http://schemas.microsoft.com/office/drawing/2016/ink" xmlns:am3d="http://schemas.microsoft.com/office/drawing/2017/model3d" xmlns:o="urn:schemas-microsoft-com:office:office" xmlns:r="http://schemas.openxmlformats.org/officeDocument/2006/relationships" xmlns:m="http://schemas.openxmlformats.org/officeDocument/2006/math" xmlns:v="urn:schemas-microsoft-com:vml" xmlns:wp14="http://schemas.microsoft.com/office/word/2010/wordprocessingDrawing" xmlns:wp="http://schemas.openxmlformats.org/drawingml/2006/wordprocessingDrawing" xmlns:w10="urn:schemas-microsoft-com:office:word" xmlns:w="http://schemas.openxmlformats.org/wordprocessingml/2006/main" xmlns:w14="http://schemas.microsoft.com/office/word/2010/wordml" xmlns:w15="http://schemas.microsoft.com/office/word/2012/wordml" xmlns:w16cid="http://schemas.microsoft.com/office/word/2016/wordml/cid" xmlns:w16se="http://schemas.microsoft.com/office/word/2015/wordml/symex" xmlns:wpg="http://schemas.microsoft.com/office/word/2010/wordprocessingGroup" xmlns:wpi="http://schemas.microsoft.com/office/word/2010/wordprocessingInk" xmlns:wne="http://schemas.microsoft.com/office/word/2006/wordml" xmlns:wps="http://schemas.microsoft.com/office/word/2010/wordprocessingShape" mc:Ignorable="w14 w15 w16se w16cid wp14">
-  <w:comment w:id="0" w:author="Grace Lyden" w:date="2025-02-17T15:18:00Z" w:initials="GL">
-    <w:p>
-      <w:pPr>
-        <w:pStyle w:val="CommentText"/>
-      </w:pPr>
-      <w:r>
-        <w:rPr>
-          <w:rStyle w:val="CommentReference"/>
-        </w:rPr>
-        <w:annotationRef/>
-      </w:r>
-      <w:r>
-        <w:t>Do we use this at all? Or LDH or hemoglobin?</w:t>
-      </w:r>
-      <w:bookmarkStart w:id="1" w:name="_GoBack"/>
-      <w:bookmarkEnd w:id="1"/>
-    </w:p>
-  </w:comment>
-  <w:comment w:id="2" w:author="Grace Lyden" w:date="2025-02-17T14:59:00Z" w:initials="GL">
+  <w:comment w:id="1" w:author="Grace Lyden" w:date="2025-02-17T14:59:00Z" w:initials="GL">
     <w:p>
       <w:pPr>
         <w:pStyle w:val="CommentText"/>
@@ -2159,33 +2045,18 @@
         <w:t>How did we select the other values?</w:t>
       </w:r>
     </w:p>
-    <w:p>
-      <w:pPr>
-        <w:pStyle w:val="CommentText"/>
-      </w:pPr>
-    </w:p>
-    <w:p>
-      <w:pPr>
-        <w:pStyle w:val="CommentText"/>
-      </w:pPr>
-      <w:r>
-        <w:t>Molly, could you add units?</w:t>
-      </w:r>
-    </w:p>
   </w:comment>
 </w:comments>
 </file>
 
 <file path=word/commentsExtended.xml><?xml version="1.0" encoding="utf-8"?>
 <w15:commentsEx xmlns:wpc="http://schemas.microsoft.com/office/word/2010/wordprocessingCanvas" xmlns:cx="http://schemas.microsoft.com/office/drawing/2014/chartex" xmlns:cx1="http://schemas.microsoft.com/office/drawing/2015/9/8/chartex" xmlns:cx2="http://schemas.microsoft.com/office/drawing/2015/10/21/chartex" xmlns:cx3="http://schemas.microsoft.com/office/drawing/2016/5/9/chartex" xmlns:cx4="http://schemas.microsoft.com/office/drawing/2016/5/10/chartex" xmlns:cx5="http://schemas.microsoft.com/office/drawing/2016/5/11/chartex" xmlns:cx6="http://schemas.microsoft.com/office/drawing/2016/5/12/chartex" xmlns:cx7="http://schemas.microsoft.com/office/drawing/2016/5/13/chartex" xmlns:cx8="http://schemas.microsoft.com/office/drawing/2016/5/14/chartex" xmlns:mc="http://schemas.openxmlformats.org/markup-compatibility/2006" xmlns:aink="http://schemas.microsoft.com/office/drawing/2016/ink" xmlns:am3d="http://schemas.microsoft.com/office/drawing/2017/model3d" xmlns:o="urn:schemas-microsoft-com:office:office" xmlns:r="http://schemas.openxmlformats.org/officeDocument/2006/relationships" xmlns:m="http://schemas.openxmlformats.org/officeDocument/2006/math" xmlns:v="urn:schemas-microsoft-com:vml" xmlns:wp14="http://schemas.microsoft.com/office/word/2010/wordprocessingDrawing" xmlns:wp="http://schemas.openxmlformats.org/drawingml/2006/wordprocessingDrawing" xmlns:w10="urn:schemas-microsoft-com:office:word" xmlns:w="http://schemas.openxmlformats.org/wordprocessingml/2006/main" xmlns:w14="http://schemas.microsoft.com/office/word/2010/wordml" xmlns:w15="http://schemas.microsoft.com/office/word/2012/wordml" xmlns:w16cid="http://schemas.microsoft.com/office/word/2016/wordml/cid" xmlns:w16se="http://schemas.microsoft.com/office/word/2015/wordml/symex" xmlns:wpg="http://schemas.microsoft.com/office/word/2010/wordprocessingGroup" xmlns:wpi="http://schemas.microsoft.com/office/word/2010/wordprocessingInk" xmlns:wne="http://schemas.microsoft.com/office/word/2006/wordml" xmlns:wps="http://schemas.microsoft.com/office/word/2010/wordprocessingShape" mc:Ignorable="w14 w15 w16se w16cid wp14">
-  <w15:commentEx w15:paraId="442761B6" w15:done="0"/>
   <w15:commentEx w15:paraId="15D735A8" w15:done="0"/>
 </w15:commentsEx>
 </file>
 
 <file path=word/commentsIds.xml><?xml version="1.0" encoding="utf-8"?>
 <w16cid:commentsIds xmlns:wpc="http://schemas.microsoft.com/office/word/2010/wordprocessingCanvas" xmlns:cx="http://schemas.microsoft.com/office/drawing/2014/chartex" xmlns:cx1="http://schemas.microsoft.com/office/drawing/2015/9/8/chartex" xmlns:cx2="http://schemas.microsoft.com/office/drawing/2015/10/21/chartex" xmlns:cx3="http://schemas.microsoft.com/office/drawing/2016/5/9/chartex" xmlns:cx4="http://schemas.microsoft.com/office/drawing/2016/5/10/chartex" xmlns:cx5="http://schemas.microsoft.com/office/drawing/2016/5/11/chartex" xmlns:cx6="http://schemas.microsoft.com/office/drawing/2016/5/12/chartex" xmlns:cx7="http://schemas.microsoft.com/office/drawing/2016/5/13/chartex" xmlns:cx8="http://schemas.microsoft.com/office/drawing/2016/5/14/chartex" xmlns:mc="http://schemas.openxmlformats.org/markup-compatibility/2006" xmlns:aink="http://schemas.microsoft.com/office/drawing/2016/ink" xmlns:am3d="http://schemas.microsoft.com/office/drawing/2017/model3d" xmlns:o="urn:schemas-microsoft-com:office:office" xmlns:r="http://schemas.openxmlformats.org/officeDocument/2006/relationships" xmlns:m="http://schemas.openxmlformats.org/officeDocument/2006/math" xmlns:v="urn:schemas-microsoft-com:vml" xmlns:wp14="http://schemas.microsoft.com/office/word/2010/wordprocessingDrawing" xmlns:wp="http://schemas.openxmlformats.org/drawingml/2006/wordprocessingDrawing" xmlns:w10="urn:schemas-microsoft-com:office:word" xmlns:w="http://schemas.openxmlformats.org/wordprocessingml/2006/main" xmlns:w14="http://schemas.microsoft.com/office/word/2010/wordml" xmlns:w15="http://schemas.microsoft.com/office/word/2012/wordml" xmlns:w16cid="http://schemas.microsoft.com/office/word/2016/wordml/cid" xmlns:w16se="http://schemas.microsoft.com/office/word/2015/wordml/symex" xmlns:wpg="http://schemas.microsoft.com/office/word/2010/wordprocessingGroup" xmlns:wpi="http://schemas.microsoft.com/office/word/2010/wordprocessingInk" xmlns:wne="http://schemas.microsoft.com/office/word/2006/wordml" xmlns:wps="http://schemas.microsoft.com/office/word/2010/wordprocessingShape" mc:Ignorable="w14 w15 w16se w16cid wp14">
-  <w16cid:commentId w16cid:paraId="442761B6" w16cid:durableId="2B5DD1B6"/>
   <w16cid:commentId w16cid:paraId="15D735A8" w16cid:durableId="2B5DCD53"/>
 </w16cid:commentsIds>
 </file>

</xml_diff>